<commit_message>
Inland transport A03–A05 v02: rebuilt with the option-label fix
The engine turned any one- or two-row form whose value held two or more
check boxes into a bare option grid and dropped its label: A04 printed
its material options without "Материјал | Material" and A04/A05 the
receipt options without "Статус на приемот | Receipt status". Rebuilt
with the corrected build_from_md (fix/docengine-review-2026-10-14);
the text of the annexes is unchanged, page counts unchanged (6/4/3).

Co-Authored-By: Claude Opus 5.5 <noreply@anthropic.com>
Claude-Session: https://claude.ai/code/session_01MmMGVFtvBKMWjhXXkehRct
</commit_message>
<xml_diff>
--- a/deliverables/inland_transport_2026-10/v02_2026-10-13/docx/WHSOP_003_A04.docx
+++ b/deliverables/inland_transport_2026-10/v02_2026-10-13/docx/WHSOP_003_A04.docx
@@ -1091,11 +1091,11 @@
     </w:p>
     <w:tbl>
       <w:tblPr>
-        <w:jc w:val="center"/>
         <w:tblLook w:firstColumn="1" w:firstRow="1" w:lastColumn="0" w:lastRow="0" w:noHBand="0" w:noVBand="1" w:val="04A0"/>
         <w:tblLayout w:type="fixed"/>
-        <w:tblW w:type="pct" w:w="5000"/>
+        <w:tblW w:type="dxa" w:w="10466"/>
         <w:tblInd w:type="dxa" w:w="0"/>
+        <w:jc w:val="center"/>
         <w:tblBorders>
           <w:top w:val="single" w:sz="4" w:space="0" w:color="2B547E"/>
           <w:left w:val="single" w:sz="4" w:space="0" w:color="2B547E"/>
@@ -1106,161 +1106,97 @@
         </w:tblBorders>
       </w:tblPr>
       <w:tblGrid>
-        <w:gridCol w:w="623"/>
-        <w:gridCol w:w="4467"/>
-        <w:gridCol w:w="283"/>
-        <w:gridCol w:w="623"/>
-        <w:gridCol w:w="4467"/>
+        <w:gridCol w:w="1181"/>
+        <w:gridCol w:w="9285"/>
       </w:tblGrid>
       <w:tr>
-        <w:tc>
-          <w:tcPr>
-            <w:vAlign w:val="center"/>
-            <w:tcW w:type="pct" w:w="297"/>
-          </w:tcPr>
-          <w:p>
-            <w:pPr>
-              <w:spacing w:before="20" w:after="20"/>
-              <w:jc w:val="center"/>
-            </w:pPr>
-            <w:r/>
-            <w:r>
-              <w:rPr>
-                <w:rFonts w:ascii="Calibri" w:hAnsi="Calibri"/>
-                <w:b w:val="0"/>
-                <w:i w:val="0"/>
-                <w:color w:val="000000"/>
-                <w:sz w:val="24"/>
-              </w:rPr>
-              <w:t>☐</w:t>
-            </w:r>
-          </w:p>
-        </w:tc>
-        <w:tc>
-          <w:tcPr>
-            <w:vAlign w:val="center"/>
-            <w:tcW w:type="pct" w:w="2134"/>
-          </w:tcPr>
-          <w:p>
-            <w:pPr>
-              <w:spacing w:before="20" w:after="20"/>
-              <w:jc w:val="center"/>
-            </w:pPr>
-            <w:r/>
-            <w:r>
-              <w:rPr>
-                <w:rFonts w:ascii="Calibri" w:hAnsi="Calibri"/>
-                <w:b w:val="0"/>
-                <w:i w:val="0"/>
-                <w:color w:val="000000"/>
-                <w:sz w:val="24"/>
-              </w:rPr>
-              <w:t>Сув цвет од канабис — GACP</w:t>
-            </w:r>
-            <w:r>
-              <w:rPr>
-                <w:rFonts w:ascii="Calibri" w:hAnsi="Calibri"/>
-                <w:b w:val="0"/>
+        <w:trPr>
+          <w:cantSplit/>
+        </w:trPr>
+        <w:tc>
+          <w:tcPr>
+            <w:shd w:val="clear" w:color="auto" w:fill="F2F2F2"/>
+            <w:vAlign w:val="center"/>
+            <w:tcW w:type="dxa" w:w="1181"/>
+          </w:tcPr>
+          <w:p>
+            <w:pPr>
+              <w:spacing w:before="20" w:after="20"/>
+              <w:jc w:val="left"/>
+            </w:pPr>
+            <w:r/>
+            <w:r>
+              <w:rPr>
+                <w:rFonts w:ascii="Calibri" w:hAnsi="Calibri"/>
+                <w:b/>
                 <w:i w:val="0"/>
                 <w:color w:val="000000"/>
                 <w:sz w:val="20"/>
               </w:rPr>
+              <w:t>Материјал</w:t>
+            </w:r>
+            <w:r>
+              <w:rPr>
+                <w:rFonts w:ascii="Calibri" w:hAnsi="Calibri"/>
+                <w:b w:val="0"/>
+                <w:i w:val="0"/>
+                <w:color w:val="000000"/>
+                <w:sz w:val="16"/>
+              </w:rPr>
               <w:t xml:space="preserve"> | </w:t>
             </w:r>
             <w:r>
               <w:rPr>
                 <w:rFonts w:ascii="Calibri" w:hAnsi="Calibri"/>
                 <w:b w:val="0"/>
+                <w:i w:val="0"/>
+                <w:color w:val="000000"/>
+                <w:sz w:val="16"/>
+              </w:rPr>
+              <w:t>Material</w:t>
+            </w:r>
+          </w:p>
+        </w:tc>
+        <w:tc>
+          <w:tcPr>
+            <w:vAlign w:val="center"/>
+            <w:tcW w:type="dxa" w:w="9285"/>
+          </w:tcPr>
+          <w:p>
+            <w:pPr>
+              <w:spacing w:before="20" w:after="20"/>
+              <w:jc w:val="center"/>
+            </w:pPr>
+            <w:r/>
+            <w:r>
+              <w:rPr>
+                <w:rFonts w:ascii="Calibri" w:hAnsi="Calibri"/>
+                <w:b w:val="0"/>
+                <w:i w:val="0"/>
+                <w:color w:val="000000"/>
+                <w:sz w:val="20"/>
+              </w:rPr>
+              <w:t>☐ Сув цвет од канабис — GACP</w:t>
+            </w:r>
+            <w:r>
+              <w:rPr>
+                <w:rFonts w:ascii="Calibri" w:hAnsi="Calibri"/>
+                <w:b w:val="0"/>
+                <w:i w:val="0"/>
+                <w:color w:val="000000"/>
+                <w:sz w:val="16"/>
+              </w:rPr>
+              <w:t xml:space="preserve"> | </w:t>
+            </w:r>
+            <w:r>
+              <w:rPr>
+                <w:rFonts w:ascii="Calibri" w:hAnsi="Calibri"/>
+                <w:b w:val="0"/>
                 <w:i/>
                 <w:color w:val="000000"/>
-                <w:sz w:val="20"/>
-              </w:rPr>
-              <w:t>Dried cannabis flower — GACP</w:t>
-            </w:r>
-          </w:p>
-        </w:tc>
-        <w:tc>
-          <w:tcPr>
-            <w:vAlign w:val="center"/>
-            <w:tcW w:type="pct" w:w="135"/>
-            <w:tcBorders>
-              <w:top w:val="nil"/>
-              <w:left w:val="nil"/>
-              <w:bottom w:val="nil"/>
-              <w:right w:val="nil"/>
-            </w:tcBorders>
-          </w:tcPr>
-          <w:p>
-            <w:pPr>
-              <w:spacing w:before="20" w:after="20"/>
-              <w:jc w:val="center"/>
-            </w:pPr>
-            <w:r/>
-          </w:p>
-        </w:tc>
-        <w:tc>
-          <w:tcPr>
-            <w:vAlign w:val="center"/>
-            <w:tcW w:type="pct" w:w="297"/>
-          </w:tcPr>
-          <w:p>
-            <w:pPr>
-              <w:spacing w:before="20" w:after="20"/>
-              <w:jc w:val="center"/>
-            </w:pPr>
-            <w:r/>
-            <w:r>
-              <w:rPr>
-                <w:rFonts w:ascii="Calibri" w:hAnsi="Calibri"/>
-                <w:b w:val="0"/>
-                <w:i w:val="0"/>
-                <w:color w:val="000000"/>
-                <w:sz w:val="24"/>
-              </w:rPr>
-              <w:t>☐</w:t>
-            </w:r>
-          </w:p>
-        </w:tc>
-        <w:tc>
-          <w:tcPr>
-            <w:vAlign w:val="center"/>
-            <w:tcW w:type="pct" w:w="2134"/>
-          </w:tcPr>
-          <w:p>
-            <w:pPr>
-              <w:spacing w:before="20" w:after="20"/>
-              <w:jc w:val="center"/>
-            </w:pPr>
-            <w:r/>
-            <w:r>
-              <w:rPr>
-                <w:rFonts w:ascii="Calibri" w:hAnsi="Calibri"/>
-                <w:b w:val="0"/>
-                <w:i w:val="0"/>
-                <w:color w:val="000000"/>
-                <w:sz w:val="24"/>
-              </w:rPr>
-              <w:t>Друго, според A01</w:t>
-            </w:r>
-            <w:r>
-              <w:rPr>
-                <w:rFonts w:ascii="Calibri" w:hAnsi="Calibri"/>
-                <w:b w:val="0"/>
-                <w:i w:val="0"/>
-                <w:color w:val="000000"/>
-                <w:sz w:val="20"/>
-              </w:rPr>
-              <w:t xml:space="preserve"> | </w:t>
-            </w:r>
-            <w:r>
-              <w:rPr>
-                <w:rFonts w:ascii="Calibri" w:hAnsi="Calibri"/>
-                <w:b w:val="0"/>
-                <w:i/>
-                <w:color w:val="000000"/>
-                <w:sz w:val="20"/>
-              </w:rPr>
-              <w:t>Other, per A01</w:t>
+                <w:sz w:val="16"/>
+              </w:rPr>
+              <w:t>Dried cannabis flower — GACP   ☐ Друго, според A01 | Other, per A01</w:t>
             </w:r>
           </w:p>
         </w:tc>
@@ -9378,11 +9314,11 @@
     </w:p>
     <w:tbl>
       <w:tblPr>
-        <w:jc w:val="center"/>
         <w:tblLook w:firstColumn="1" w:firstRow="1" w:lastColumn="0" w:lastRow="0" w:noHBand="0" w:noVBand="1" w:val="04A0"/>
         <w:tblLayout w:type="fixed"/>
-        <w:tblW w:type="pct" w:w="5000"/>
+        <w:tblW w:type="dxa" w:w="10466"/>
         <w:tblInd w:type="dxa" w:w="0"/>
+        <w:jc w:val="center"/>
         <w:tblBorders>
           <w:top w:val="single" w:sz="4" w:space="0" w:color="2B547E"/>
           <w:left w:val="single" w:sz="4" w:space="0" w:color="2B547E"/>
@@ -9393,275 +9329,98 @@
         </w:tblBorders>
       </w:tblPr>
       <w:tblGrid>
-        <w:gridCol w:w="623"/>
-        <w:gridCol w:w="4467"/>
-        <w:gridCol w:w="283"/>
-        <w:gridCol w:w="623"/>
-        <w:gridCol w:w="4467"/>
+        <w:gridCol w:w="3277"/>
+        <w:gridCol w:w="7189"/>
       </w:tblGrid>
       <w:tr>
-        <w:tc>
-          <w:tcPr>
-            <w:vAlign w:val="center"/>
-            <w:tcW w:type="pct" w:w="297"/>
-          </w:tcPr>
-          <w:p>
-            <w:pPr>
-              <w:spacing w:before="20" w:after="20"/>
-              <w:jc w:val="center"/>
-            </w:pPr>
-            <w:r/>
-            <w:r>
-              <w:rPr>
-                <w:rFonts w:ascii="Calibri" w:hAnsi="Calibri"/>
-                <w:b w:val="0"/>
-                <w:i w:val="0"/>
-                <w:color w:val="000000"/>
-                <w:sz w:val="24"/>
-              </w:rPr>
-              <w:t>☐</w:t>
-            </w:r>
-          </w:p>
-        </w:tc>
-        <w:tc>
-          <w:tcPr>
-            <w:vAlign w:val="center"/>
-            <w:tcW w:type="pct" w:w="2134"/>
-          </w:tcPr>
-          <w:p>
-            <w:pPr>
-              <w:spacing w:before="20" w:after="20"/>
-              <w:jc w:val="center"/>
-            </w:pPr>
-            <w:r/>
-            <w:r>
-              <w:rPr>
-                <w:rFonts w:ascii="Calibri" w:hAnsi="Calibri"/>
-                <w:b w:val="0"/>
-                <w:i w:val="0"/>
-                <w:color w:val="000000"/>
-                <w:sz w:val="24"/>
-              </w:rPr>
-              <w:t>Прифатено</w:t>
-            </w:r>
-            <w:r>
-              <w:rPr>
-                <w:rFonts w:ascii="Calibri" w:hAnsi="Calibri"/>
-                <w:b w:val="0"/>
+        <w:trPr>
+          <w:cantSplit/>
+        </w:trPr>
+        <w:tc>
+          <w:tcPr>
+            <w:shd w:val="clear" w:color="auto" w:fill="F2F2F2"/>
+            <w:vAlign w:val="center"/>
+            <w:tcW w:type="dxa" w:w="3277"/>
+          </w:tcPr>
+          <w:p>
+            <w:pPr>
+              <w:spacing w:before="20" w:after="20"/>
+              <w:jc w:val="left"/>
+            </w:pPr>
+            <w:r/>
+            <w:r>
+              <w:rPr>
+                <w:rFonts w:ascii="Calibri" w:hAnsi="Calibri"/>
+                <w:b/>
                 <w:i w:val="0"/>
                 <w:color w:val="000000"/>
                 <w:sz w:val="20"/>
               </w:rPr>
+              <w:t>Статус на приемот (A05, дел Б)</w:t>
+            </w:r>
+            <w:r>
+              <w:rPr>
+                <w:rFonts w:ascii="Calibri" w:hAnsi="Calibri"/>
+                <w:b w:val="0"/>
+                <w:i w:val="0"/>
+                <w:color w:val="000000"/>
+                <w:sz w:val="16"/>
+              </w:rPr>
               <w:t xml:space="preserve"> | </w:t>
             </w:r>
             <w:r>
               <w:rPr>
                 <w:rFonts w:ascii="Calibri" w:hAnsi="Calibri"/>
                 <w:b w:val="0"/>
+                <w:i w:val="0"/>
+                <w:color w:val="000000"/>
+                <w:sz w:val="16"/>
+              </w:rPr>
+              <w:t>Receipt status (A05, part B)</w:t>
+            </w:r>
+          </w:p>
+        </w:tc>
+        <w:tc>
+          <w:tcPr>
+            <w:vAlign w:val="center"/>
+            <w:tcW w:type="dxa" w:w="7189"/>
+          </w:tcPr>
+          <w:p>
+            <w:pPr>
+              <w:spacing w:before="20" w:after="20"/>
+              <w:jc w:val="center"/>
+            </w:pPr>
+            <w:r/>
+            <w:r>
+              <w:rPr>
+                <w:rFonts w:ascii="Calibri" w:hAnsi="Calibri"/>
+                <w:b w:val="0"/>
+                <w:i w:val="0"/>
+                <w:color w:val="000000"/>
+                <w:sz w:val="20"/>
+              </w:rPr>
+              <w:t>☐ Прифатено</w:t>
+            </w:r>
+            <w:r>
+              <w:rPr>
+                <w:rFonts w:ascii="Calibri" w:hAnsi="Calibri"/>
+                <w:b w:val="0"/>
+                <w:i w:val="0"/>
+                <w:color w:val="000000"/>
+                <w:sz w:val="16"/>
+              </w:rPr>
+              <w:t xml:space="preserve"> | </w:t>
+            </w:r>
+            <w:r>
+              <w:rPr>
+                <w:rFonts w:ascii="Calibri" w:hAnsi="Calibri"/>
+                <w:b w:val="0"/>
                 <w:i/>
                 <w:color w:val="000000"/>
-                <w:sz w:val="20"/>
-              </w:rPr>
-              <w:t>Accepted</w:t>
-            </w:r>
-          </w:p>
-        </w:tc>
-        <w:tc>
-          <w:tcPr>
-            <w:vAlign w:val="center"/>
-            <w:tcW w:type="pct" w:w="135"/>
-            <w:tcBorders>
-              <w:top w:val="nil"/>
-              <w:left w:val="nil"/>
-              <w:bottom w:val="nil"/>
-              <w:right w:val="nil"/>
-            </w:tcBorders>
-          </w:tcPr>
-          <w:p>
-            <w:pPr>
-              <w:spacing w:before="20" w:after="20"/>
-              <w:jc w:val="center"/>
-            </w:pPr>
-            <w:r/>
-          </w:p>
-        </w:tc>
-        <w:tc>
-          <w:tcPr>
-            <w:vAlign w:val="center"/>
-            <w:tcW w:type="pct" w:w="297"/>
-          </w:tcPr>
-          <w:p>
-            <w:pPr>
-              <w:spacing w:before="20" w:after="20"/>
-              <w:jc w:val="center"/>
-            </w:pPr>
-            <w:r/>
-            <w:r>
-              <w:rPr>
-                <w:rFonts w:ascii="Calibri" w:hAnsi="Calibri"/>
-                <w:b w:val="0"/>
-                <w:i w:val="0"/>
-                <w:color w:val="000000"/>
-                <w:sz w:val="24"/>
-              </w:rPr>
-              <w:t>☐</w:t>
-            </w:r>
-          </w:p>
-        </w:tc>
-        <w:tc>
-          <w:tcPr>
-            <w:vAlign w:val="center"/>
-            <w:tcW w:type="pct" w:w="2134"/>
-          </w:tcPr>
-          <w:p>
-            <w:pPr>
-              <w:spacing w:before="20" w:after="20"/>
-              <w:jc w:val="center"/>
-            </w:pPr>
-            <w:r/>
-            <w:r>
-              <w:rPr>
-                <w:rFonts w:ascii="Calibri" w:hAnsi="Calibri"/>
-                <w:b w:val="0"/>
-                <w:i w:val="0"/>
-                <w:color w:val="000000"/>
-                <w:sz w:val="24"/>
-              </w:rPr>
-              <w:t>Одбиено</w:t>
-            </w:r>
-            <w:r>
-              <w:rPr>
-                <w:rFonts w:ascii="Calibri" w:hAnsi="Calibri"/>
-                <w:b w:val="0"/>
-                <w:i w:val="0"/>
-                <w:color w:val="000000"/>
-                <w:sz w:val="20"/>
-              </w:rPr>
-              <w:t xml:space="preserve"> | </w:t>
-            </w:r>
-            <w:r>
-              <w:rPr>
-                <w:rFonts w:ascii="Calibri" w:hAnsi="Calibri"/>
-                <w:b w:val="0"/>
-                <w:i/>
-                <w:color w:val="000000"/>
-                <w:sz w:val="20"/>
-              </w:rPr>
-              <w:t>Rejected</w:t>
-            </w:r>
-          </w:p>
-        </w:tc>
-      </w:tr>
-      <w:tr>
-        <w:tc>
-          <w:tcPr>
-            <w:vAlign w:val="center"/>
-            <w:tcW w:type="pct" w:w="297"/>
-          </w:tcPr>
-          <w:p>
-            <w:pPr>
-              <w:spacing w:before="20" w:after="20"/>
-              <w:jc w:val="center"/>
-            </w:pPr>
-            <w:r/>
-            <w:r>
-              <w:rPr>
-                <w:rFonts w:ascii="Calibri" w:hAnsi="Calibri"/>
-                <w:b w:val="0"/>
-                <w:i w:val="0"/>
-                <w:color w:val="000000"/>
-                <w:sz w:val="24"/>
-              </w:rPr>
-              <w:t>☐</w:t>
-            </w:r>
-          </w:p>
-        </w:tc>
-        <w:tc>
-          <w:tcPr>
-            <w:vAlign w:val="center"/>
-            <w:tcW w:type="pct" w:w="2134"/>
-          </w:tcPr>
-          <w:p>
-            <w:pPr>
-              <w:spacing w:before="20" w:after="20"/>
-              <w:jc w:val="center"/>
-            </w:pPr>
-            <w:r/>
-            <w:r>
-              <w:rPr>
-                <w:rFonts w:ascii="Calibri" w:hAnsi="Calibri"/>
-                <w:b w:val="0"/>
-                <w:i w:val="0"/>
-                <w:color w:val="000000"/>
-                <w:sz w:val="24"/>
-              </w:rPr>
-              <w:t>Прифатено со резерва</w:t>
-            </w:r>
-            <w:r>
-              <w:rPr>
-                <w:rFonts w:ascii="Calibri" w:hAnsi="Calibri"/>
-                <w:b w:val="0"/>
-                <w:i w:val="0"/>
-                <w:color w:val="000000"/>
-                <w:sz w:val="20"/>
-              </w:rPr>
-              <w:t xml:space="preserve"> | </w:t>
-            </w:r>
-            <w:r>
-              <w:rPr>
-                <w:rFonts w:ascii="Calibri" w:hAnsi="Calibri"/>
-                <w:b w:val="0"/>
-                <w:i/>
-                <w:color w:val="000000"/>
-                <w:sz w:val="20"/>
-              </w:rPr>
-              <w:t>Accepted with reservation</w:t>
-            </w:r>
-          </w:p>
-        </w:tc>
-        <w:tc>
-          <w:tcPr>
-            <w:vAlign w:val="center"/>
-            <w:tcW w:type="pct" w:w="135"/>
-            <w:tcBorders>
-              <w:top w:val="nil"/>
-              <w:left w:val="nil"/>
-              <w:bottom w:val="nil"/>
-              <w:right w:val="nil"/>
-            </w:tcBorders>
-          </w:tcPr>
-          <w:p>
-            <w:pPr>
-              <w:spacing w:before="20" w:after="20"/>
-              <w:jc w:val="center"/>
-            </w:pPr>
-            <w:r/>
-          </w:p>
-        </w:tc>
-        <w:tc>
-          <w:tcPr>
-            <w:vAlign w:val="center"/>
-            <w:tcW w:type="pct" w:w="297"/>
-          </w:tcPr>
-          <w:p>
-            <w:pPr>
-              <w:spacing w:before="20" w:after="20"/>
-              <w:jc w:val="center"/>
-            </w:pPr>
-            <w:r/>
-          </w:p>
-        </w:tc>
-        <w:tc>
-          <w:tcPr>
-            <w:vAlign w:val="center"/>
-            <w:tcW w:type="pct" w:w="2134"/>
-          </w:tcPr>
-          <w:p>
-            <w:pPr>
-              <w:spacing w:before="20" w:after="20"/>
-              <w:jc w:val="center"/>
-            </w:pPr>
-            <w:r/>
+                <w:sz w:val="16"/>
+              </w:rPr>
+              <w:t>Accepted   ☐ Прифатено со резерва | Accepted with reservation   ☐ Одбиено | Rejected</w:t>
+            </w:r>
           </w:p>
         </w:tc>
       </w:tr>

</xml_diff>